<commit_message>
[SessionEnd 自動保存] 2026-10-05 21:29
對話結束時 SessionEnd hook 自動保存。詳細工作摘要請查 Obsidian 工作筆記：notebookLM/工作筆記.md
</commit_message>
<xml_diff>
--- a/抽離教學_數學/初三數學/IEP第8-9點_初三數學補救班_26-27全學年_融合班通用草稿.docx
+++ b/抽離教學_數學/初三數學/IEP第8-9點_初三數學補救班_26-27全學年_融合班通用草稿.docx
@@ -297,23 +297,13 @@
                 <w:sz w:val="20"/>
               </w:rPr>
             </w:pPr>
-            <w:proofErr w:type="gramStart"/>
             <w:r>
               <w:rPr>
                 <w:b/>
                 <w:bCs/>
                 <w:sz w:val="20"/>
               </w:rPr>
-              <w:t>起迄</w:t>
-            </w:r>
-            <w:proofErr w:type="gramEnd"/>
-            <w:r>
-              <w:rPr>
-                <w:b/>
-                <w:bCs/>
-                <w:sz w:val="20"/>
-              </w:rPr>
-              <w:t>日期</w:t>
+              <w:t>起迄日期</w:t>
             </w:r>
           </w:p>
         </w:tc>
@@ -747,14 +737,12 @@
                 <w:sz w:val="20"/>
               </w:rPr>
             </w:pPr>
-            <w:proofErr w:type="gramStart"/>
             <w:r>
               <w:rPr>
                 <w:sz w:val="20"/>
               </w:rPr>
               <w:t>週</w:t>
             </w:r>
-            <w:proofErr w:type="gramEnd"/>
           </w:p>
         </w:tc>
         <w:tc>
@@ -1183,10 +1171,8 @@
                 <w:sz w:val="20"/>
                 <w:szCs w:val="20"/>
               </w:rPr>
-              <w:t>透過課後輔導（補救教學），沿用學生已學的講義、練習與工具卡，以重做基礎題及錯題訂正的方式，鞏固方程、函數、圓與相似三角的基礎技能，建立分步驟解題與自我檢查的習慣。了解學生的理解程度。</w:t>
-            </w:r>
-            <w:proofErr w:type="gramStart"/>
-            <w:proofErr w:type="gramEnd"/>
+              <w:t>於課後輔導沿用既有教材與工具卡，藉由重做基礎題及錯題訂正，鞏固方程、函數、圓與相似形核心技能，建立分步解題與自檢習慣，並評估理解成效。</w:t>
+            </w:r>
           </w:p>
         </w:tc>
         <w:tc>
@@ -1209,7 +1195,14 @@
                 <w:sz w:val="20"/>
                 <w:szCs w:val="20"/>
               </w:rPr>
-              <w:t>1. 能在提示步驟卡與公式卡下，重做已學單元的基礎題</w:t>
+              <w:t xml:space="preserve">1. </w:t>
+            </w:r>
+            <w:r>
+              <w:rPr>
+                <w:sz w:val="20"/>
+                <w:szCs w:val="20"/>
+              </w:rPr>
+              <w:t>能在提示步驟卡與公式卡下，重做已學單元的基礎題</w:t>
             </w:r>
           </w:p>
           <w:p>
@@ -1222,7 +1215,14 @@
                 <w:sz w:val="20"/>
                 <w:szCs w:val="20"/>
               </w:rPr>
-              <w:t>2. 能說出該單元解題的關鍵步驟與所用公式</w:t>
+              <w:t xml:space="preserve">2. </w:t>
+            </w:r>
+            <w:r>
+              <w:rPr>
+                <w:sz w:val="20"/>
+                <w:szCs w:val="20"/>
+              </w:rPr>
+              <w:t>能說出該單元解題的關鍵步驟與所用公式</w:t>
             </w:r>
           </w:p>
           <w:p>
@@ -1235,7 +1235,14 @@
                 <w:sz w:val="20"/>
                 <w:szCs w:val="20"/>
               </w:rPr>
-              <w:t>3. 能指出自己錯題的成因並完成訂正</w:t>
+              <w:t xml:space="preserve">3. </w:t>
+            </w:r>
+            <w:r>
+              <w:rPr>
+                <w:sz w:val="20"/>
+                <w:szCs w:val="20"/>
+              </w:rPr>
+              <w:t>能指出自己錯題的成因並完成訂正</w:t>
             </w:r>
           </w:p>
           <w:p>
@@ -1248,7 +1255,14 @@
                 <w:sz w:val="20"/>
                 <w:szCs w:val="20"/>
               </w:rPr>
-              <w:t>4. 能圈出仍未掌握的題目並主動提問</w:t>
+              <w:t xml:space="preserve">4. </w:t>
+            </w:r>
+            <w:r>
+              <w:rPr>
+                <w:sz w:val="20"/>
+                <w:szCs w:val="20"/>
+              </w:rPr>
+              <w:t>能圈出仍未掌握的題目並主動提問</w:t>
             </w:r>
           </w:p>
         </w:tc>
@@ -1271,7 +1285,25 @@
               <w:rPr>
                 <w:rFonts w:hint="eastAsia"/>
               </w:rPr>
-              <w:t>課後輔導(小組教學)</w:t>
+              <w:t>課後補救教學</w:t>
+            </w:r>
+            <w:r>
+              <w:rPr>
+                <w:rFonts w:hint="eastAsia"/>
+              </w:rPr>
+              <w:t>(</w:t>
+            </w:r>
+            <w:r>
+              <w:rPr>
+                <w:rFonts w:hint="eastAsia"/>
+              </w:rPr>
+              <w:t>小組教學</w:t>
+            </w:r>
+            <w:r>
+              <w:rPr>
+                <w:rFonts w:hint="eastAsia"/>
+              </w:rPr>
+              <w:t>)</w:t>
             </w:r>
           </w:p>
         </w:tc>
@@ -1366,15 +1398,30 @@
             <w:pPr>
               <w:spacing w:line="340" w:lineRule="exact"/>
               <w:ind w:firstLine="152"/>
+            </w:pPr>
+            <w:r>
               <w:rPr>
                 <w:rFonts w:hint="eastAsia"/>
               </w:rPr>
-            </w:pPr>
+              <w:t xml:space="preserve">2026/09 </w:t>
+            </w:r>
             <w:r>
               <w:rPr>
                 <w:rFonts w:hint="eastAsia"/>
               </w:rPr>
-              <w:t>2026/09 – 2027/06</w:t>
+              <w:t>–</w:t>
+            </w:r>
+            <w:r>
+              <w:rPr>
+                <w:rFonts w:hint="eastAsia"/>
+              </w:rPr>
+              <w:t xml:space="preserve"> 2027/0</w:t>
+            </w:r>
+            <w:r>
+              <w:rPr>
+                <w:rFonts w:hint="eastAsia"/>
+              </w:rPr>
+              <w:t>6</w:t>
             </w:r>
           </w:p>
         </w:tc>
@@ -1397,7 +1444,25 @@
               <w:rPr>
                 <w:rFonts w:hint="eastAsia"/>
               </w:rPr>
-              <w:t>江志樂(數學資源老師)</w:t>
+              <w:t>江志樂</w:t>
+            </w:r>
+            <w:r>
+              <w:rPr>
+                <w:rFonts w:hint="eastAsia"/>
+              </w:rPr>
+              <w:t>(</w:t>
+            </w:r>
+            <w:r>
+              <w:rPr>
+                <w:rFonts w:hint="eastAsia"/>
+              </w:rPr>
+              <w:t>數學資源老師</w:t>
+            </w:r>
+            <w:r>
+              <w:rPr>
+                <w:rFonts w:hint="eastAsia"/>
+              </w:rPr>
+              <w:t>)</w:t>
             </w:r>
           </w:p>
         </w:tc>
@@ -1563,14 +1628,12 @@
                 <w:sz w:val="20"/>
               </w:rPr>
             </w:pPr>
-            <w:proofErr w:type="gramStart"/>
             <w:r>
               <w:rPr>
                 <w:sz w:val="20"/>
               </w:rPr>
               <w:t>週</w:t>
             </w:r>
-            <w:proofErr w:type="gramEnd"/>
           </w:p>
         </w:tc>
         <w:tc>
@@ -1792,7 +1855,7 @@
         </w:tblPrEx>
         <w:trPr>
           <w:cantSplit/>
-          <w:trHeight w:val="339"/>
+          <w:trHeight w:val="2930"/>
         </w:trPr>
         <w:tc>
           <w:tcPr>
@@ -2290,14 +2353,12 @@
                 <w:sz w:val="20"/>
               </w:rPr>
             </w:pPr>
-            <w:proofErr w:type="gramStart"/>
             <w:r>
               <w:rPr>
                 <w:sz w:val="20"/>
               </w:rPr>
               <w:t>週</w:t>
             </w:r>
-            <w:proofErr w:type="gramEnd"/>
           </w:p>
         </w:tc>
         <w:tc>
@@ -3012,14 +3073,12 @@
                 <w:sz w:val="20"/>
               </w:rPr>
             </w:pPr>
-            <w:proofErr w:type="gramStart"/>
             <w:r>
               <w:rPr>
                 <w:sz w:val="20"/>
               </w:rPr>
               <w:t>週</w:t>
             </w:r>
-            <w:proofErr w:type="gramEnd"/>
           </w:p>
         </w:tc>
         <w:tc>
@@ -3754,14 +3813,12 @@
                 <w:sz w:val="20"/>
               </w:rPr>
             </w:pPr>
-            <w:proofErr w:type="gramStart"/>
             <w:r>
               <w:rPr>
                 <w:sz w:val="20"/>
               </w:rPr>
               <w:t>週</w:t>
             </w:r>
-            <w:proofErr w:type="gramEnd"/>
           </w:p>
         </w:tc>
         <w:tc>
@@ -4480,14 +4537,12 @@
                 <w:sz w:val="20"/>
               </w:rPr>
             </w:pPr>
-            <w:proofErr w:type="gramStart"/>
             <w:r>
               <w:rPr>
                 <w:sz w:val="20"/>
               </w:rPr>
               <w:t>週</w:t>
             </w:r>
-            <w:proofErr w:type="gramEnd"/>
           </w:p>
         </w:tc>
         <w:tc>
@@ -4913,7 +4968,25 @@
               <w:jc w:val="both"/>
             </w:pPr>
             <w:r>
-              <w:t>本表為課後輔導（補救教學）版本，逢週四第九節（16:15–16:55），全學年 31 節，服務對象跨初三三個班別；抽離課堂另有獨立 IEP 表。</w:t>
+              <w:t>本表為課後輔導（補救教學）版本，逢週四第九節（</w:t>
+            </w:r>
+            <w:r>
+              <w:t>16:15–16:55</w:t>
+            </w:r>
+            <w:r>
+              <w:t>），全學年</w:t>
+            </w:r>
+            <w:r>
+              <w:t xml:space="preserve"> 31 </w:t>
+            </w:r>
+            <w:r>
+              <w:t>節，服務對象跨初三三個班別；抽離課堂另有獨立</w:t>
+            </w:r>
+            <w:r>
+              <w:t xml:space="preserve"> IEP </w:t>
+            </w:r>
+            <w:r>
+              <w:t>表。</w:t>
             </w:r>
           </w:p>
         </w:tc>
@@ -5119,7 +5192,29 @@
                 <w:sz w:val="20"/>
                 <w:szCs w:val="20"/>
               </w:rPr>
-              <w:t>(課後輔導)</w:t>
+              <w:t>(</w:t>
+            </w:r>
+            <w:r>
+              <w:rPr>
+                <w:sz w:val="20"/>
+                <w:szCs w:val="20"/>
+              </w:rPr>
+              <w:t>課後</w:t>
+            </w:r>
+            <w:r>
+              <w:rPr>
+                <w:rFonts w:hint="eastAsia"/>
+                <w:sz w:val="20"/>
+                <w:szCs w:val="20"/>
+              </w:rPr>
+              <w:t>補救教學</w:t>
+            </w:r>
+            <w:r>
+              <w:rPr>
+                <w:sz w:val="20"/>
+                <w:szCs w:val="20"/>
+              </w:rPr>
+              <w:t>)</w:t>
             </w:r>
           </w:p>
         </w:tc>
@@ -5632,7 +5727,13 @@
               <w:t>（科任老師）區樂賢（科任老師）</w:t>
             </w:r>
             <w:r>
-              <w:t xml:space="preserve"> </w:t>
+              <w:rPr>
+                <w:rFonts w:hint="eastAsia"/>
+              </w:rPr>
+              <w:t>李偉東</w:t>
+            </w:r>
+            <w:r>
+              <w:t>（科任老師）</w:t>
             </w:r>
           </w:p>
           <w:p>
@@ -5730,10 +5831,15 @@
                 <w:sz w:val="20"/>
                 <w:szCs w:val="20"/>
               </w:rPr>
-              <w:t>1. 能重做並訂正一元二次方程、分式方程與二元二次方程組的基礎題，說出所用方法與驗根步驟</w:t>
-            </w:r>
-            <w:proofErr w:type="gramStart"/>
-            <w:proofErr w:type="gramEnd"/>
+              <w:t xml:space="preserve">1. </w:t>
+            </w:r>
+            <w:r>
+              <w:rPr>
+                <w:sz w:val="20"/>
+                <w:szCs w:val="20"/>
+              </w:rPr>
+              <w:t>能重做並訂正一元二次方程、分式方程與二元二次方程組的基礎題，說出所用方法與驗根步驟</w:t>
+            </w:r>
           </w:p>
           <w:p>
             <w:pPr>
@@ -5744,7 +5850,28 @@
                 <w:sz w:val="20"/>
                 <w:szCs w:val="20"/>
               </w:rPr>
-              <w:t>2. 能重做並訂正二次函數圖像平移，以及圖像與 x 軸交點個數的基礎題</w:t>
+              <w:t xml:space="preserve">2. </w:t>
+            </w:r>
+            <w:r>
+              <w:rPr>
+                <w:sz w:val="20"/>
+                <w:szCs w:val="20"/>
+              </w:rPr>
+              <w:t>能重做並訂正二次函數圖像平移，以及圖像與</w:t>
+            </w:r>
+            <w:r>
+              <w:rPr>
+                <w:sz w:val="20"/>
+                <w:szCs w:val="20"/>
+              </w:rPr>
+              <w:t xml:space="preserve"> x </w:t>
+            </w:r>
+            <w:r>
+              <w:rPr>
+                <w:sz w:val="20"/>
+                <w:szCs w:val="20"/>
+              </w:rPr>
+              <w:t>軸交點個數的基礎題</w:t>
             </w:r>
           </w:p>
           <w:p>
@@ -5756,7 +5883,14 @@
                 <w:sz w:val="20"/>
                 <w:szCs w:val="20"/>
               </w:rPr>
-              <w:t>3. 能重做並訂正旋轉、中心對稱與圓的性質、切線及兩圓位置關係的作圖與計算題</w:t>
+              <w:t xml:space="preserve">3. </w:t>
+            </w:r>
+            <w:r>
+              <w:rPr>
+                <w:sz w:val="20"/>
+                <w:szCs w:val="20"/>
+              </w:rPr>
+              <w:t>能重做並訂正旋轉、中心對稱與圓的性質、切線及兩圓位置關係的作圖與計算題</w:t>
             </w:r>
           </w:p>
           <w:p>
@@ -5768,7 +5902,14 @@
                 <w:sz w:val="20"/>
                 <w:szCs w:val="20"/>
               </w:rPr>
-              <w:t>4. 能重做並訂正概率、反比例函數與圖形相似的基礎題</w:t>
+              <w:t xml:space="preserve">4. </w:t>
+            </w:r>
+            <w:r>
+              <w:rPr>
+                <w:sz w:val="20"/>
+                <w:szCs w:val="20"/>
+              </w:rPr>
+              <w:t>能重做並訂正概率、反比例函數與圖形相似的基礎題</w:t>
             </w:r>
           </w:p>
           <w:p>
@@ -5784,97 +5925,20 @@
                 <w:sz w:val="20"/>
                 <w:szCs w:val="20"/>
               </w:rPr>
-              <w:t>5. 能重做並訂正銳角三角函數與解直角三角形的應用題，並辨識投影的兩種類型</w:t>
-            </w:r>
-            <w:proofErr w:type="gramStart"/>
-            <w:proofErr w:type="gramEnd"/>
-            <w:proofErr w:type="gramStart"/>
-            <w:proofErr w:type="gramEnd"/>
-          </w:p>
-          <w:p>
-            <w:pPr>
-              <w:tabs>
-                <w:tab w:val="left" w:pos="2099"/>
-                <w:tab w:val="left" w:pos="4252"/>
-                <w:tab w:val="left" w:pos="7202"/>
-              </w:tabs>
-              <w:spacing w:beforeLines="50" w:before="180"/>
-              <w:ind w:leftChars="63" w:left="113"/>
-              <w:rPr>
-                <w:sz w:val="20"/>
-              </w:rPr>
-            </w:pPr>
-            <w:r>
-              <w:rPr>
-                <w:rFonts w:hint="eastAsia"/>
-                <w:sz w:val="20"/>
-                <w:highlight w:val="yellow"/>
-              </w:rPr>
-              <w:t>如有需要</w:t>
-            </w:r>
-            <w:r>
-              <w:rPr>
-                <w:rFonts w:hint="eastAsia"/>
-                <w:sz w:val="20"/>
-              </w:rPr>
-              <w:t>:</w:t>
+              <w:t xml:space="preserve">5. </w:t>
+            </w:r>
+            <w:r>
+              <w:rPr>
+                <w:sz w:val="20"/>
+                <w:szCs w:val="20"/>
+              </w:rPr>
+              <w:t>能重做並訂正銳角三角函數與解直角三角形的應用題，並辨識投影的兩種類型</w:t>
             </w:r>
           </w:p>
           <w:p>
             <w:pPr>
               <w:spacing w:after="40" w:line="300" w:lineRule="auto"/>
-              <w:rPr>
-                <w:rFonts w:hint="eastAsia"/>
-              </w:rPr>
-            </w:pPr>
-            <w:proofErr w:type="gramStart"/>
-            <w:r>
-              <w:rPr>
-                <w:sz w:val="20"/>
-                <w:szCs w:val="20"/>
-              </w:rPr>
-              <w:t>備注</w:t>
-            </w:r>
-            <w:proofErr w:type="gramEnd"/>
-            <w:r>
-              <w:rPr>
-                <w:sz w:val="20"/>
-                <w:szCs w:val="20"/>
-              </w:rPr>
-              <w:t>：該生在數學科</w:t>
-            </w:r>
-            <w:proofErr w:type="gramStart"/>
-            <w:r>
-              <w:rPr>
-                <w:sz w:val="20"/>
-                <w:szCs w:val="20"/>
-              </w:rPr>
-              <w:t>大測、統測</w:t>
-            </w:r>
-            <w:proofErr w:type="gramEnd"/>
-            <w:r>
-              <w:rPr>
-                <w:sz w:val="20"/>
-                <w:szCs w:val="20"/>
-              </w:rPr>
-              <w:t>及考試使用特別卷，資源老師、數學科組長及科任老師負責</w:t>
-            </w:r>
-            <w:proofErr w:type="gramStart"/>
-            <w:r>
-              <w:rPr>
-                <w:sz w:val="20"/>
-                <w:szCs w:val="20"/>
-              </w:rPr>
-              <w:t>檢視卷面的</w:t>
-            </w:r>
-            <w:proofErr w:type="gramEnd"/>
-            <w:r>
-              <w:rPr>
-                <w:sz w:val="20"/>
-                <w:szCs w:val="20"/>
-              </w:rPr>
-              <w:t>內容和計分標準。</w:t>
-            </w:r>
+            </w:pPr>
           </w:p>
         </w:tc>
       </w:tr>
@@ -6092,7 +6156,6 @@
               </w:rPr>
               <w:t xml:space="preserve"> </w:t>
             </w:r>
-            <w:proofErr w:type="gramStart"/>
             <w:r>
               <w:rPr>
                 <w:rFonts w:hint="eastAsia"/>
@@ -6100,7 +6163,6 @@
               </w:rPr>
               <w:t>增潤課程</w:t>
             </w:r>
-            <w:proofErr w:type="gramEnd"/>
             <w:r>
               <w:rPr>
                 <w:sz w:val="20"/>
@@ -6494,7 +6556,6 @@
               <w:spacing w:beforeLines="50" w:before="180"/>
               <w:ind w:leftChars="63" w:left="113"/>
               <w:rPr>
-                <w:rFonts w:hint="eastAsia"/>
                 <w:sz w:val="20"/>
               </w:rPr>
             </w:pPr>
@@ -6509,7 +6570,7 @@
                   <w:calcOnExit w:val="0"/>
                   <w:checkBox>
                     <w:sizeAuto/>
-                    <w:default w:val="1"/>
+                    <w:default w:val="0"/>
                   </w:checkBox>
                 </w:ffData>
               </w:fldChar>
@@ -6551,65 +6612,6 @@
                 <w:sz w:val="20"/>
               </w:rPr>
               <w:t>其他</w:t>
-            </w:r>
-            <w:r>
-              <w:rPr>
-                <w:rFonts w:hint="eastAsia"/>
-                <w:sz w:val="20"/>
-              </w:rPr>
-              <w:t>（</w:t>
-            </w:r>
-            <w:r>
-              <w:rPr>
-                <w:rFonts w:hint="eastAsia"/>
-                <w:sz w:val="20"/>
-              </w:rPr>
-              <w:t>課後</w:t>
-            </w:r>
-            <w:r>
-              <w:rPr>
-                <w:sz w:val="20"/>
-              </w:rPr>
-              <w:t>補救輔導</w:t>
-            </w:r>
-            <w:r>
-              <w:rPr>
-                <w:sz w:val="20"/>
-              </w:rPr>
-              <w:t xml:space="preserve"> - </w:t>
-            </w:r>
-            <w:r>
-              <w:rPr>
-                <w:sz w:val="20"/>
-              </w:rPr>
-              <w:t>以鞏固基礎、訂正錯題</w:t>
-            </w:r>
-            <w:r>
-              <w:rPr>
-                <w:rFonts w:hint="eastAsia"/>
-                <w:sz w:val="20"/>
-              </w:rPr>
-              <w:t>）</w:t>
-            </w:r>
-            <w:r>
-              <w:rPr>
-                <w:sz w:val="20"/>
-              </w:rPr>
-              <w:t>該</w:t>
-            </w:r>
-            <w:proofErr w:type="gramStart"/>
-            <w:r>
-              <w:rPr>
-                <w:sz w:val="20"/>
-              </w:rPr>
-              <w:t>生數學科大測、統測</w:t>
-            </w:r>
-            <w:proofErr w:type="gramEnd"/>
-            <w:r>
-              <w:rPr>
-                <w:sz w:val="20"/>
-              </w:rPr>
-              <w:t>及考試時需要提供抽離及延長時間。</w:t>
             </w:r>
           </w:p>
         </w:tc>
@@ -6703,19 +6705,11 @@
                 <w:sz w:val="20"/>
               </w:rPr>
             </w:pPr>
-            <w:proofErr w:type="gramStart"/>
-            <w:r>
-              <w:rPr>
-                <w:sz w:val="20"/>
-              </w:rPr>
-              <w:t>起迄</w:t>
-            </w:r>
-            <w:proofErr w:type="gramEnd"/>
-            <w:r>
-              <w:rPr>
-                <w:sz w:val="20"/>
-              </w:rPr>
-              <w:t>日期</w:t>
+            <w:r>
+              <w:rPr>
+                <w:sz w:val="20"/>
+              </w:rPr>
+              <w:t>起迄日期</w:t>
             </w:r>
           </w:p>
         </w:tc>
@@ -6918,7 +6912,14 @@
                 <w:sz w:val="20"/>
                 <w:szCs w:val="20"/>
               </w:rPr>
-              <w:t>1-1. 能重做直接開平方法的題目，並按常數項的正負判斷根的個數</w:t>
+              <w:t xml:space="preserve">1-1. </w:t>
+            </w:r>
+            <w:r>
+              <w:rPr>
+                <w:sz w:val="20"/>
+                <w:szCs w:val="20"/>
+              </w:rPr>
+              <w:t>能重做直接開平方法的題目，並按常數項的正負判斷根的個數</w:t>
             </w:r>
           </w:p>
         </w:tc>
@@ -6940,7 +6941,19 @@
               <w:rPr>
                 <w:rFonts w:hint="eastAsia"/>
               </w:rPr>
-              <w:t>2026/09 – 2026/09</w:t>
+              <w:t xml:space="preserve">2026/09 </w:t>
+            </w:r>
+            <w:r>
+              <w:rPr>
+                <w:rFonts w:hint="eastAsia"/>
+              </w:rPr>
+              <w:t>–</w:t>
+            </w:r>
+            <w:r>
+              <w:rPr>
+                <w:rFonts w:hint="eastAsia"/>
+              </w:rPr>
+              <w:t xml:space="preserve"> 2026/09</w:t>
             </w:r>
           </w:p>
         </w:tc>
@@ -6986,10 +6999,15 @@
                 <w:sz w:val="20"/>
                 <w:szCs w:val="20"/>
               </w:rPr>
-              <w:t>a11：手順卡</w:t>
-            </w:r>
-            <w:proofErr w:type="gramStart"/>
-            <w:proofErr w:type="gramEnd"/>
+              <w:t>a11</w:t>
+            </w:r>
+            <w:r>
+              <w:rPr>
+                <w:sz w:val="20"/>
+                <w:szCs w:val="20"/>
+              </w:rPr>
+              <w:t>：手順卡</w:t>
+            </w:r>
           </w:p>
         </w:tc>
         <w:tc>
@@ -7006,7 +7024,6 @@
               <w:spacing w:before="80" w:line="360" w:lineRule="exact"/>
               <w:jc w:val="center"/>
             </w:pPr>
-            <w:r/>
           </w:p>
         </w:tc>
       </w:tr>
@@ -7044,7 +7061,14 @@
                 <w:sz w:val="20"/>
                 <w:szCs w:val="20"/>
               </w:rPr>
-              <w:t>1-2. 能重做因式分解法的題目，並指出「兩邊同除以未知數」會漏根</w:t>
+              <w:t xml:space="preserve">1-2. </w:t>
+            </w:r>
+            <w:r>
+              <w:rPr>
+                <w:sz w:val="20"/>
+                <w:szCs w:val="20"/>
+              </w:rPr>
+              <w:t>能重做因式分解法的題目，並指出「兩邊同除以未知數」會漏根</w:t>
             </w:r>
           </w:p>
         </w:tc>
@@ -7066,7 +7090,19 @@
               <w:rPr>
                 <w:rFonts w:hint="eastAsia"/>
               </w:rPr>
-              <w:t>2026/09 – 2026/09</w:t>
+              <w:t xml:space="preserve">2026/09 </w:t>
+            </w:r>
+            <w:r>
+              <w:rPr>
+                <w:rFonts w:hint="eastAsia"/>
+              </w:rPr>
+              <w:t>–</w:t>
+            </w:r>
+            <w:r>
+              <w:rPr>
+                <w:rFonts w:hint="eastAsia"/>
+              </w:rPr>
+              <w:t xml:space="preserve"> 2026/09</w:t>
             </w:r>
           </w:p>
         </w:tc>
@@ -7112,10 +7148,15 @@
                 <w:sz w:val="20"/>
                 <w:szCs w:val="20"/>
               </w:rPr>
-              <w:t>a11：手順卡</w:t>
-            </w:r>
-            <w:proofErr w:type="gramStart"/>
-            <w:proofErr w:type="gramEnd"/>
+              <w:t>a11</w:t>
+            </w:r>
+            <w:r>
+              <w:rPr>
+                <w:sz w:val="20"/>
+                <w:szCs w:val="20"/>
+              </w:rPr>
+              <w:t>：手順卡</w:t>
+            </w:r>
           </w:p>
         </w:tc>
         <w:tc>
@@ -7132,7 +7173,6 @@
               <w:spacing w:before="80" w:line="360" w:lineRule="exact"/>
               <w:jc w:val="center"/>
             </w:pPr>
-            <w:r/>
           </w:p>
         </w:tc>
       </w:tr>
@@ -7170,7 +7210,14 @@
                 <w:sz w:val="20"/>
                 <w:szCs w:val="20"/>
               </w:rPr>
-              <w:t>1-3. 能重做判別式的題目，說出三種情況各自對應的根的個數</w:t>
+              <w:t xml:space="preserve">1-3. </w:t>
+            </w:r>
+            <w:r>
+              <w:rPr>
+                <w:sz w:val="20"/>
+                <w:szCs w:val="20"/>
+              </w:rPr>
+              <w:t>能重做判別式的題目，說出三種情況各自對應的根的個數</w:t>
             </w:r>
           </w:p>
         </w:tc>
@@ -7192,7 +7239,19 @@
               <w:rPr>
                 <w:rFonts w:hint="eastAsia"/>
               </w:rPr>
-              <w:t>2026/09 – 2026/09</w:t>
+              <w:t xml:space="preserve">2026/09 </w:t>
+            </w:r>
+            <w:r>
+              <w:rPr>
+                <w:rFonts w:hint="eastAsia"/>
+              </w:rPr>
+              <w:t>–</w:t>
+            </w:r>
+            <w:r>
+              <w:rPr>
+                <w:rFonts w:hint="eastAsia"/>
+              </w:rPr>
+              <w:t xml:space="preserve"> 2026/09</w:t>
             </w:r>
           </w:p>
         </w:tc>
@@ -7238,10 +7297,15 @@
                 <w:sz w:val="20"/>
                 <w:szCs w:val="20"/>
               </w:rPr>
-              <w:t>a11：公式卡</w:t>
-            </w:r>
-            <w:proofErr w:type="gramStart"/>
-            <w:proofErr w:type="gramEnd"/>
+              <w:t>a11</w:t>
+            </w:r>
+            <w:r>
+              <w:rPr>
+                <w:sz w:val="20"/>
+                <w:szCs w:val="20"/>
+              </w:rPr>
+              <w:t>：公式卡</w:t>
+            </w:r>
           </w:p>
         </w:tc>
         <w:tc>
@@ -7258,7 +7322,6 @@
               <w:spacing w:before="80" w:line="360" w:lineRule="exact"/>
               <w:jc w:val="center"/>
             </w:pPr>
-            <w:r/>
           </w:p>
         </w:tc>
       </w:tr>
@@ -7296,7 +7359,14 @@
                 <w:sz w:val="20"/>
                 <w:szCs w:val="20"/>
               </w:rPr>
-              <w:t>1-4. 能重做增長率應用題，寫出設方程的步驟</w:t>
+              <w:t xml:space="preserve">1-4. </w:t>
+            </w:r>
+            <w:r>
+              <w:rPr>
+                <w:sz w:val="20"/>
+                <w:szCs w:val="20"/>
+              </w:rPr>
+              <w:t>能重做增長率應用題，寫出設方程的步驟</w:t>
             </w:r>
           </w:p>
         </w:tc>
@@ -7318,7 +7388,19 @@
               <w:rPr>
                 <w:rFonts w:hint="eastAsia"/>
               </w:rPr>
-              <w:t>2026/10 – 2026/10</w:t>
+              <w:t xml:space="preserve">2026/10 </w:t>
+            </w:r>
+            <w:r>
+              <w:rPr>
+                <w:rFonts w:hint="eastAsia"/>
+              </w:rPr>
+              <w:t>–</w:t>
+            </w:r>
+            <w:r>
+              <w:rPr>
+                <w:rFonts w:hint="eastAsia"/>
+              </w:rPr>
+              <w:t xml:space="preserve"> 2026/10</w:t>
             </w:r>
           </w:p>
         </w:tc>
@@ -7366,8 +7448,6 @@
               </w:rPr>
               <w:t>a3,a4</w:t>
             </w:r>
-            <w:proofErr w:type="gramStart"/>
-            <w:proofErr w:type="gramEnd"/>
           </w:p>
         </w:tc>
         <w:tc>
@@ -7384,7 +7464,6 @@
               <w:spacing w:before="80" w:line="360" w:lineRule="exact"/>
               <w:jc w:val="center"/>
             </w:pPr>
-            <w:r/>
           </w:p>
         </w:tc>
       </w:tr>
@@ -7422,7 +7501,14 @@
                 <w:sz w:val="20"/>
                 <w:szCs w:val="20"/>
               </w:rPr>
-              <w:t>1-5. 能重做分式方程應用題，並完成驗根步驟</w:t>
+              <w:t xml:space="preserve">1-5. </w:t>
+            </w:r>
+            <w:r>
+              <w:rPr>
+                <w:sz w:val="20"/>
+                <w:szCs w:val="20"/>
+              </w:rPr>
+              <w:t>能重做分式方程應用題，並完成驗根步驟</w:t>
             </w:r>
           </w:p>
         </w:tc>
@@ -7444,7 +7530,19 @@
               <w:rPr>
                 <w:rFonts w:hint="eastAsia"/>
               </w:rPr>
-              <w:t>2026/10 – 2026/10</w:t>
+              <w:t xml:space="preserve">2026/10 </w:t>
+            </w:r>
+            <w:r>
+              <w:rPr>
+                <w:rFonts w:hint="eastAsia"/>
+              </w:rPr>
+              <w:t>–</w:t>
+            </w:r>
+            <w:r>
+              <w:rPr>
+                <w:rFonts w:hint="eastAsia"/>
+              </w:rPr>
+              <w:t xml:space="preserve"> 2026/10</w:t>
             </w:r>
           </w:p>
         </w:tc>
@@ -7492,8 +7590,6 @@
               </w:rPr>
               <w:t>a3,a6</w:t>
             </w:r>
-            <w:proofErr w:type="gramStart"/>
-            <w:proofErr w:type="gramEnd"/>
           </w:p>
         </w:tc>
         <w:tc>
@@ -7510,7 +7606,6 @@
               <w:spacing w:before="80" w:line="360" w:lineRule="exact"/>
               <w:jc w:val="center"/>
             </w:pPr>
-            <w:r/>
           </w:p>
         </w:tc>
       </w:tr>
@@ -7548,7 +7643,14 @@
                 <w:sz w:val="20"/>
                 <w:szCs w:val="20"/>
               </w:rPr>
-              <w:t>1-6. 能重做二元二次方程組的代入消元題，並把答案寫成一對數</w:t>
+              <w:t xml:space="preserve">1-6. </w:t>
+            </w:r>
+            <w:r>
+              <w:rPr>
+                <w:sz w:val="20"/>
+                <w:szCs w:val="20"/>
+              </w:rPr>
+              <w:t>能重做二元二次方程組的代入消元題，並把答案寫成一對數</w:t>
             </w:r>
           </w:p>
         </w:tc>
@@ -7570,7 +7672,19 @@
               <w:rPr>
                 <w:rFonts w:hint="eastAsia"/>
               </w:rPr>
-              <w:t>2026/10 – 2026/10</w:t>
+              <w:t xml:space="preserve">2026/10 </w:t>
+            </w:r>
+            <w:r>
+              <w:rPr>
+                <w:rFonts w:hint="eastAsia"/>
+              </w:rPr>
+              <w:t>–</w:t>
+            </w:r>
+            <w:r>
+              <w:rPr>
+                <w:rFonts w:hint="eastAsia"/>
+              </w:rPr>
+              <w:t xml:space="preserve"> 2026/10</w:t>
             </w:r>
           </w:p>
         </w:tc>
@@ -7616,10 +7730,15 @@
                 <w:sz w:val="20"/>
                 <w:szCs w:val="20"/>
               </w:rPr>
-              <w:t>a11：手順卡</w:t>
-            </w:r>
-            <w:proofErr w:type="gramStart"/>
-            <w:proofErr w:type="gramEnd"/>
+              <w:t>a11</w:t>
+            </w:r>
+            <w:r>
+              <w:rPr>
+                <w:sz w:val="20"/>
+                <w:szCs w:val="20"/>
+              </w:rPr>
+              <w:t>：手順卡</w:t>
+            </w:r>
           </w:p>
         </w:tc>
         <w:tc>
@@ -7636,7 +7755,6 @@
               <w:spacing w:before="80" w:line="360" w:lineRule="exact"/>
               <w:jc w:val="center"/>
             </w:pPr>
-            <w:r/>
           </w:p>
         </w:tc>
       </w:tr>
@@ -7674,7 +7792,15 @@
                 <w:sz w:val="20"/>
                 <w:szCs w:val="20"/>
               </w:rPr>
-              <w:t>1-7. 能在找錯題中圈出漏了驗根的位置並改正</w:t>
+              <w:lastRenderedPageBreak/>
+              <w:t xml:space="preserve">1-7. </w:t>
+            </w:r>
+            <w:r>
+              <w:rPr>
+                <w:sz w:val="20"/>
+                <w:szCs w:val="20"/>
+              </w:rPr>
+              <w:t>能在找錯題中圈出漏了驗根的位置並改正</w:t>
             </w:r>
           </w:p>
         </w:tc>
@@ -7696,7 +7822,19 @@
               <w:rPr>
                 <w:rFonts w:hint="eastAsia"/>
               </w:rPr>
-              <w:t>2026/10 – 2026/10</w:t>
+              <w:t xml:space="preserve">2026/10 </w:t>
+            </w:r>
+            <w:r>
+              <w:rPr>
+                <w:rFonts w:hint="eastAsia"/>
+              </w:rPr>
+              <w:t>–</w:t>
+            </w:r>
+            <w:r>
+              <w:rPr>
+                <w:rFonts w:hint="eastAsia"/>
+              </w:rPr>
+              <w:t xml:space="preserve"> 2026/10</w:t>
             </w:r>
           </w:p>
         </w:tc>
@@ -7744,8 +7882,6 @@
               </w:rPr>
               <w:t>a3</w:t>
             </w:r>
-            <w:proofErr w:type="gramStart"/>
-            <w:proofErr w:type="gramEnd"/>
           </w:p>
         </w:tc>
         <w:tc>
@@ -7762,7 +7898,6 @@
               <w:spacing w:before="80" w:line="360" w:lineRule="exact"/>
               <w:jc w:val="center"/>
             </w:pPr>
-            <w:r/>
           </w:p>
         </w:tc>
       </w:tr>
@@ -7800,7 +7935,14 @@
                 <w:sz w:val="20"/>
                 <w:szCs w:val="20"/>
               </w:rPr>
-              <w:t>2-1. 能重做二次函數圖像平移的題目，按「先左右、後上下」的次序覆述</w:t>
+              <w:t xml:space="preserve">2-1. </w:t>
+            </w:r>
+            <w:r>
+              <w:rPr>
+                <w:sz w:val="20"/>
+                <w:szCs w:val="20"/>
+              </w:rPr>
+              <w:t>能重做二次函數圖像平移的題目，按「先左右、後上下」的次序覆述</w:t>
             </w:r>
           </w:p>
         </w:tc>
@@ -7822,7 +7964,19 @@
               <w:rPr>
                 <w:rFonts w:hint="eastAsia"/>
               </w:rPr>
-              <w:t>2026/11 – 2026/11</w:t>
+              <w:t xml:space="preserve">2026/11 </w:t>
+            </w:r>
+            <w:r>
+              <w:rPr>
+                <w:rFonts w:hint="eastAsia"/>
+              </w:rPr>
+              <w:t>–</w:t>
+            </w:r>
+            <w:r>
+              <w:rPr>
+                <w:rFonts w:hint="eastAsia"/>
+              </w:rPr>
+              <w:t xml:space="preserve"> 2026/11</w:t>
             </w:r>
           </w:p>
         </w:tc>
@@ -7868,10 +8022,15 @@
                 <w:sz w:val="20"/>
                 <w:szCs w:val="20"/>
               </w:rPr>
-              <w:t>a11：手順卡</w:t>
-            </w:r>
-            <w:proofErr w:type="gramStart"/>
-            <w:proofErr w:type="gramEnd"/>
+              <w:t>a11</w:t>
+            </w:r>
+            <w:r>
+              <w:rPr>
+                <w:sz w:val="20"/>
+                <w:szCs w:val="20"/>
+              </w:rPr>
+              <w:t>：手順卡</w:t>
+            </w:r>
           </w:p>
         </w:tc>
         <w:tc>
@@ -7888,7 +8047,6 @@
               <w:spacing w:before="80" w:line="360" w:lineRule="exact"/>
               <w:jc w:val="center"/>
             </w:pPr>
-            <w:r/>
           </w:p>
         </w:tc>
       </w:tr>
@@ -7926,7 +8084,28 @@
                 <w:sz w:val="20"/>
                 <w:szCs w:val="20"/>
               </w:rPr>
-              <w:t>2-2. 能重做用判別式判斷圖像與 x 軸交點個數的題目</w:t>
+              <w:t xml:space="preserve">2-2. </w:t>
+            </w:r>
+            <w:r>
+              <w:rPr>
+                <w:sz w:val="20"/>
+                <w:szCs w:val="20"/>
+              </w:rPr>
+              <w:t>能重做用判別式判斷圖像與</w:t>
+            </w:r>
+            <w:r>
+              <w:rPr>
+                <w:sz w:val="20"/>
+                <w:szCs w:val="20"/>
+              </w:rPr>
+              <w:t xml:space="preserve"> x </w:t>
+            </w:r>
+            <w:r>
+              <w:rPr>
+                <w:sz w:val="20"/>
+                <w:szCs w:val="20"/>
+              </w:rPr>
+              <w:t>軸交點個數的題目</w:t>
             </w:r>
           </w:p>
         </w:tc>
@@ -7948,7 +8127,19 @@
               <w:rPr>
                 <w:rFonts w:hint="eastAsia"/>
               </w:rPr>
-              <w:t>2026/11 – 2026/11</w:t>
+              <w:t xml:space="preserve">2026/11 </w:t>
+            </w:r>
+            <w:r>
+              <w:rPr>
+                <w:rFonts w:hint="eastAsia"/>
+              </w:rPr>
+              <w:t>–</w:t>
+            </w:r>
+            <w:r>
+              <w:rPr>
+                <w:rFonts w:hint="eastAsia"/>
+              </w:rPr>
+              <w:t xml:space="preserve"> 2026/11</w:t>
             </w:r>
           </w:p>
         </w:tc>
@@ -7994,10 +8185,15 @@
                 <w:sz w:val="20"/>
                 <w:szCs w:val="20"/>
               </w:rPr>
-              <w:t>a11：公式卡</w:t>
-            </w:r>
-            <w:proofErr w:type="gramStart"/>
-            <w:proofErr w:type="gramEnd"/>
+              <w:t>a11</w:t>
+            </w:r>
+            <w:r>
+              <w:rPr>
+                <w:sz w:val="20"/>
+                <w:szCs w:val="20"/>
+              </w:rPr>
+              <w:t>：公式卡</w:t>
+            </w:r>
           </w:p>
         </w:tc>
         <w:tc>
@@ -8014,7 +8210,6 @@
               <w:spacing w:before="80" w:line="360" w:lineRule="exact"/>
               <w:jc w:val="center"/>
             </w:pPr>
-            <w:r/>
           </w:p>
         </w:tc>
       </w:tr>
@@ -8052,7 +8247,42 @@
                 <w:sz w:val="20"/>
                 <w:szCs w:val="20"/>
               </w:rPr>
-              <w:t>3-1. 能重做 90°、180° 旋轉的作圖題，每點量度相同角度與距離</w:t>
+              <w:t xml:space="preserve">3-1. </w:t>
+            </w:r>
+            <w:r>
+              <w:rPr>
+                <w:sz w:val="20"/>
+                <w:szCs w:val="20"/>
+              </w:rPr>
+              <w:t>能重做</w:t>
+            </w:r>
+            <w:r>
+              <w:rPr>
+                <w:sz w:val="20"/>
+                <w:szCs w:val="20"/>
+              </w:rPr>
+              <w:t xml:space="preserve"> 90°</w:t>
+            </w:r>
+            <w:r>
+              <w:rPr>
+                <w:sz w:val="20"/>
+                <w:szCs w:val="20"/>
+              </w:rPr>
+              <w:t>、</w:t>
+            </w:r>
+            <w:r>
+              <w:rPr>
+                <w:sz w:val="20"/>
+                <w:szCs w:val="20"/>
+              </w:rPr>
+              <w:t xml:space="preserve">180° </w:t>
+            </w:r>
+            <w:r>
+              <w:rPr>
+                <w:sz w:val="20"/>
+                <w:szCs w:val="20"/>
+              </w:rPr>
+              <w:t>旋轉的作圖題，每點量度相同角度與距離</w:t>
             </w:r>
           </w:p>
         </w:tc>
@@ -8074,7 +8304,19 @@
               <w:rPr>
                 <w:rFonts w:hint="eastAsia"/>
               </w:rPr>
-              <w:t>2026/11 – 2026/12</w:t>
+              <w:t xml:space="preserve">2026/11 </w:t>
+            </w:r>
+            <w:r>
+              <w:rPr>
+                <w:rFonts w:hint="eastAsia"/>
+              </w:rPr>
+              <w:t>–</w:t>
+            </w:r>
+            <w:r>
+              <w:rPr>
+                <w:rFonts w:hint="eastAsia"/>
+              </w:rPr>
+              <w:t xml:space="preserve"> 2026/12</w:t>
             </w:r>
           </w:p>
         </w:tc>
@@ -8122,8 +8364,6 @@
               </w:rPr>
               <w:t>a3</w:t>
             </w:r>
-            <w:proofErr w:type="gramStart"/>
-            <w:proofErr w:type="gramEnd"/>
           </w:p>
         </w:tc>
         <w:tc>
@@ -8140,7 +8380,6 @@
               <w:spacing w:before="80" w:line="360" w:lineRule="exact"/>
               <w:jc w:val="center"/>
             </w:pPr>
-            <w:r/>
           </w:p>
         </w:tc>
       </w:tr>
@@ -8178,7 +8417,28 @@
                 <w:sz w:val="20"/>
                 <w:szCs w:val="20"/>
               </w:rPr>
-              <w:t>3-2. 能重做旋轉與中心對稱的綜合題，說出 180° 旋轉即中心對稱</w:t>
+              <w:t xml:space="preserve">3-2. </w:t>
+            </w:r>
+            <w:r>
+              <w:rPr>
+                <w:sz w:val="20"/>
+                <w:szCs w:val="20"/>
+              </w:rPr>
+              <w:t>能重做旋轉與中心對稱的綜合題，說出</w:t>
+            </w:r>
+            <w:r>
+              <w:rPr>
+                <w:sz w:val="20"/>
+                <w:szCs w:val="20"/>
+              </w:rPr>
+              <w:t xml:space="preserve"> 180° </w:t>
+            </w:r>
+            <w:r>
+              <w:rPr>
+                <w:sz w:val="20"/>
+                <w:szCs w:val="20"/>
+              </w:rPr>
+              <w:t>旋轉即中心對稱</w:t>
             </w:r>
           </w:p>
         </w:tc>
@@ -8200,7 +8460,19 @@
               <w:rPr>
                 <w:rFonts w:hint="eastAsia"/>
               </w:rPr>
-              <w:t>2026/12 – 2026/12</w:t>
+              <w:t xml:space="preserve">2026/12 </w:t>
+            </w:r>
+            <w:r>
+              <w:rPr>
+                <w:rFonts w:hint="eastAsia"/>
+              </w:rPr>
+              <w:t>–</w:t>
+            </w:r>
+            <w:r>
+              <w:rPr>
+                <w:rFonts w:hint="eastAsia"/>
+              </w:rPr>
+              <w:t xml:space="preserve"> 2026/12</w:t>
             </w:r>
           </w:p>
         </w:tc>
@@ -8248,8 +8520,6 @@
               </w:rPr>
               <w:t>a3</w:t>
             </w:r>
-            <w:proofErr w:type="gramStart"/>
-            <w:proofErr w:type="gramEnd"/>
           </w:p>
         </w:tc>
         <w:tc>
@@ -8266,7 +8536,6 @@
               <w:spacing w:before="80" w:line="360" w:lineRule="exact"/>
               <w:jc w:val="center"/>
             </w:pPr>
-            <w:r/>
           </w:p>
         </w:tc>
       </w:tr>
@@ -8304,7 +8573,14 @@
                 <w:sz w:val="20"/>
                 <w:szCs w:val="20"/>
               </w:rPr>
-              <w:t>3-3. 能重做垂徑定理的應用題</w:t>
+              <w:t xml:space="preserve">3-3. </w:t>
+            </w:r>
+            <w:r>
+              <w:rPr>
+                <w:sz w:val="20"/>
+                <w:szCs w:val="20"/>
+              </w:rPr>
+              <w:t>能重做垂徑定理的應用題</w:t>
             </w:r>
           </w:p>
         </w:tc>
@@ -8326,7 +8602,19 @@
               <w:rPr>
                 <w:rFonts w:hint="eastAsia"/>
               </w:rPr>
-              <w:t>2026/12 – 2026/12</w:t>
+              <w:t xml:space="preserve">2026/12 </w:t>
+            </w:r>
+            <w:r>
+              <w:rPr>
+                <w:rFonts w:hint="eastAsia"/>
+              </w:rPr>
+              <w:t>–</w:t>
+            </w:r>
+            <w:r>
+              <w:rPr>
+                <w:rFonts w:hint="eastAsia"/>
+              </w:rPr>
+              <w:t xml:space="preserve"> 2026/12</w:t>
             </w:r>
           </w:p>
         </w:tc>
@@ -8372,10 +8660,15 @@
                 <w:sz w:val="20"/>
                 <w:szCs w:val="20"/>
               </w:rPr>
-              <w:t>a11：公式卡</w:t>
-            </w:r>
-            <w:proofErr w:type="gramStart"/>
-            <w:proofErr w:type="gramEnd"/>
+              <w:t>a11</w:t>
+            </w:r>
+            <w:r>
+              <w:rPr>
+                <w:sz w:val="20"/>
+                <w:szCs w:val="20"/>
+              </w:rPr>
+              <w:t>：公式卡</w:t>
+            </w:r>
           </w:p>
         </w:tc>
         <w:tc>
@@ -8392,7 +8685,6 @@
               <w:spacing w:before="80" w:line="360" w:lineRule="exact"/>
               <w:jc w:val="center"/>
             </w:pPr>
-            <w:r/>
           </w:p>
         </w:tc>
       </w:tr>
@@ -8430,7 +8722,14 @@
                 <w:sz w:val="20"/>
                 <w:szCs w:val="20"/>
               </w:rPr>
-              <w:t>3-4. 能重做點和圓的位置關係與切線長定理的題目</w:t>
+              <w:t xml:space="preserve">3-4. </w:t>
+            </w:r>
+            <w:r>
+              <w:rPr>
+                <w:sz w:val="20"/>
+                <w:szCs w:val="20"/>
+              </w:rPr>
+              <w:t>能重做點和圓的位置關係與切線長定理的題目</w:t>
             </w:r>
           </w:p>
         </w:tc>
@@ -8452,7 +8751,19 @@
               <w:rPr>
                 <w:rFonts w:hint="eastAsia"/>
               </w:rPr>
-              <w:t>2026/12 – 2027/01</w:t>
+              <w:t xml:space="preserve">2026/12 </w:t>
+            </w:r>
+            <w:r>
+              <w:rPr>
+                <w:rFonts w:hint="eastAsia"/>
+              </w:rPr>
+              <w:t>–</w:t>
+            </w:r>
+            <w:r>
+              <w:rPr>
+                <w:rFonts w:hint="eastAsia"/>
+              </w:rPr>
+              <w:t xml:space="preserve"> 2027/01</w:t>
             </w:r>
           </w:p>
         </w:tc>
@@ -8498,10 +8809,15 @@
                 <w:sz w:val="20"/>
                 <w:szCs w:val="20"/>
               </w:rPr>
-              <w:t>a11：公式卡</w:t>
-            </w:r>
-            <w:proofErr w:type="gramStart"/>
-            <w:proofErr w:type="gramEnd"/>
+              <w:t>a11</w:t>
+            </w:r>
+            <w:r>
+              <w:rPr>
+                <w:sz w:val="20"/>
+                <w:szCs w:val="20"/>
+              </w:rPr>
+              <w:t>：公式卡</w:t>
+            </w:r>
           </w:p>
         </w:tc>
         <w:tc>
@@ -8518,7 +8834,6 @@
               <w:spacing w:before="80" w:line="360" w:lineRule="exact"/>
               <w:jc w:val="center"/>
             </w:pPr>
-            <w:r/>
           </w:p>
         </w:tc>
       </w:tr>
@@ -8556,7 +8871,14 @@
                 <w:sz w:val="20"/>
                 <w:szCs w:val="20"/>
               </w:rPr>
-              <w:t>3-5. 能重做兩圓位置關係的辨識題，說出五種情況</w:t>
+              <w:t xml:space="preserve">3-5. </w:t>
+            </w:r>
+            <w:r>
+              <w:rPr>
+                <w:sz w:val="20"/>
+                <w:szCs w:val="20"/>
+              </w:rPr>
+              <w:t>能重做兩圓位置關係的辨識題，說出五種情況</w:t>
             </w:r>
           </w:p>
         </w:tc>
@@ -8578,7 +8900,19 @@
               <w:rPr>
                 <w:rFonts w:hint="eastAsia"/>
               </w:rPr>
-              <w:t>2027/01 – 2027/01</w:t>
+              <w:t xml:space="preserve">2027/01 </w:t>
+            </w:r>
+            <w:r>
+              <w:rPr>
+                <w:rFonts w:hint="eastAsia"/>
+              </w:rPr>
+              <w:t>–</w:t>
+            </w:r>
+            <w:r>
+              <w:rPr>
+                <w:rFonts w:hint="eastAsia"/>
+              </w:rPr>
+              <w:t xml:space="preserve"> 2027/01</w:t>
             </w:r>
           </w:p>
         </w:tc>
@@ -8624,10 +8958,15 @@
                 <w:sz w:val="20"/>
                 <w:szCs w:val="20"/>
               </w:rPr>
-              <w:t>a11：對照卡</w:t>
-            </w:r>
-            <w:proofErr w:type="gramStart"/>
-            <w:proofErr w:type="gramEnd"/>
+              <w:t>a11</w:t>
+            </w:r>
+            <w:r>
+              <w:rPr>
+                <w:sz w:val="20"/>
+                <w:szCs w:val="20"/>
+              </w:rPr>
+              <w:t>：對照卡</w:t>
+            </w:r>
           </w:p>
         </w:tc>
         <w:tc>
@@ -8644,7 +8983,6 @@
               <w:spacing w:before="80" w:line="360" w:lineRule="exact"/>
               <w:jc w:val="center"/>
             </w:pPr>
-            <w:r/>
           </w:p>
         </w:tc>
       </w:tr>
@@ -8682,7 +9020,14 @@
                 <w:sz w:val="20"/>
                 <w:szCs w:val="20"/>
               </w:rPr>
-              <w:t>4-1. 能重做隨機事件分類的題目，並說出概率的定義</w:t>
+              <w:t xml:space="preserve">4-1. </w:t>
+            </w:r>
+            <w:r>
+              <w:rPr>
+                <w:sz w:val="20"/>
+                <w:szCs w:val="20"/>
+              </w:rPr>
+              <w:t>能重做隨機事件分類的題目，並說出概率的定義</w:t>
             </w:r>
           </w:p>
         </w:tc>
@@ -8704,7 +9049,19 @@
               <w:rPr>
                 <w:rFonts w:hint="eastAsia"/>
               </w:rPr>
-              <w:t>2027/01 – 2027/02</w:t>
+              <w:t xml:space="preserve">2027/01 </w:t>
+            </w:r>
+            <w:r>
+              <w:rPr>
+                <w:rFonts w:hint="eastAsia"/>
+              </w:rPr>
+              <w:t>–</w:t>
+            </w:r>
+            <w:r>
+              <w:rPr>
+                <w:rFonts w:hint="eastAsia"/>
+              </w:rPr>
+              <w:t xml:space="preserve"> 2027/02</w:t>
             </w:r>
           </w:p>
         </w:tc>
@@ -8752,8 +9109,6 @@
               </w:rPr>
               <w:t>a3</w:t>
             </w:r>
-            <w:proofErr w:type="gramStart"/>
-            <w:proofErr w:type="gramEnd"/>
           </w:p>
         </w:tc>
         <w:tc>
@@ -8770,7 +9125,6 @@
               <w:spacing w:before="80" w:line="360" w:lineRule="exact"/>
               <w:jc w:val="center"/>
             </w:pPr>
-            <w:r/>
           </w:p>
         </w:tc>
       </w:tr>
@@ -8808,7 +9162,14 @@
                 <w:sz w:val="20"/>
                 <w:szCs w:val="20"/>
               </w:rPr>
-              <w:t>4-2. 能重做放回與不放回的對照題，說出兩者結果數不同</w:t>
+              <w:t xml:space="preserve">4-2. </w:t>
+            </w:r>
+            <w:r>
+              <w:rPr>
+                <w:sz w:val="20"/>
+                <w:szCs w:val="20"/>
+              </w:rPr>
+              <w:t>能重做放回與不放回的對照題，說出兩者結果數不同</w:t>
             </w:r>
           </w:p>
         </w:tc>
@@ -8830,7 +9191,19 @@
               <w:rPr>
                 <w:rFonts w:hint="eastAsia"/>
               </w:rPr>
-              <w:t>2027/02 – 2027/02</w:t>
+              <w:t xml:space="preserve">2027/02 </w:t>
+            </w:r>
+            <w:r>
+              <w:rPr>
+                <w:rFonts w:hint="eastAsia"/>
+              </w:rPr>
+              <w:t>–</w:t>
+            </w:r>
+            <w:r>
+              <w:rPr>
+                <w:rFonts w:hint="eastAsia"/>
+              </w:rPr>
+              <w:t xml:space="preserve"> 2027/02</w:t>
             </w:r>
           </w:p>
         </w:tc>
@@ -8876,10 +9249,15 @@
                 <w:sz w:val="20"/>
                 <w:szCs w:val="20"/>
               </w:rPr>
-              <w:t>a11：對照卡</w:t>
-            </w:r>
-            <w:proofErr w:type="gramStart"/>
-            <w:proofErr w:type="gramEnd"/>
+              <w:t>a11</w:t>
+            </w:r>
+            <w:r>
+              <w:rPr>
+                <w:sz w:val="20"/>
+                <w:szCs w:val="20"/>
+              </w:rPr>
+              <w:t>：對照卡</w:t>
+            </w:r>
           </w:p>
         </w:tc>
         <w:tc>
@@ -8896,7 +9274,6 @@
               <w:spacing w:before="80" w:line="360" w:lineRule="exact"/>
               <w:jc w:val="center"/>
             </w:pPr>
-            <w:r/>
           </w:p>
         </w:tc>
       </w:tr>
@@ -8934,7 +9311,14 @@
                 <w:sz w:val="20"/>
                 <w:szCs w:val="20"/>
               </w:rPr>
-              <w:t>4-3. 能重做用頻率估計概率的題目</w:t>
+              <w:t xml:space="preserve">4-3. </w:t>
+            </w:r>
+            <w:r>
+              <w:rPr>
+                <w:sz w:val="20"/>
+                <w:szCs w:val="20"/>
+              </w:rPr>
+              <w:t>能重做用頻率估計概率的題目</w:t>
             </w:r>
           </w:p>
         </w:tc>
@@ -8956,7 +9340,19 @@
               <w:rPr>
                 <w:rFonts w:hint="eastAsia"/>
               </w:rPr>
-              <w:t>2027/02 – 2027/02</w:t>
+              <w:t xml:space="preserve">2027/02 </w:t>
+            </w:r>
+            <w:r>
+              <w:rPr>
+                <w:rFonts w:hint="eastAsia"/>
+              </w:rPr>
+              <w:t>–</w:t>
+            </w:r>
+            <w:r>
+              <w:rPr>
+                <w:rFonts w:hint="eastAsia"/>
+              </w:rPr>
+              <w:t xml:space="preserve"> 2027/02</w:t>
             </w:r>
           </w:p>
         </w:tc>
@@ -9004,8 +9400,6 @@
               </w:rPr>
               <w:t>b5</w:t>
             </w:r>
-            <w:proofErr w:type="gramStart"/>
-            <w:proofErr w:type="gramEnd"/>
           </w:p>
         </w:tc>
         <w:tc>
@@ -9022,7 +9416,6 @@
               <w:spacing w:before="80" w:line="360" w:lineRule="exact"/>
               <w:jc w:val="center"/>
             </w:pPr>
-            <w:r/>
           </w:p>
         </w:tc>
       </w:tr>
@@ -9060,7 +9453,14 @@
                 <w:sz w:val="20"/>
                 <w:szCs w:val="20"/>
               </w:rPr>
-              <w:t>4-4. 能重做用列表法求概率的挑戰題，逐一核對有沒有漏數</w:t>
+              <w:t xml:space="preserve">4-4. </w:t>
+            </w:r>
+            <w:r>
+              <w:rPr>
+                <w:sz w:val="20"/>
+                <w:szCs w:val="20"/>
+              </w:rPr>
+              <w:t>能重做用列表法求概率的挑戰題，逐一核對有沒有漏數</w:t>
             </w:r>
           </w:p>
         </w:tc>
@@ -9082,7 +9482,19 @@
               <w:rPr>
                 <w:rFonts w:hint="eastAsia"/>
               </w:rPr>
-              <w:t>2027/03 – 2027/03</w:t>
+              <w:t xml:space="preserve">2027/03 </w:t>
+            </w:r>
+            <w:r>
+              <w:rPr>
+                <w:rFonts w:hint="eastAsia"/>
+              </w:rPr>
+              <w:t>–</w:t>
+            </w:r>
+            <w:r>
+              <w:rPr>
+                <w:rFonts w:hint="eastAsia"/>
+              </w:rPr>
+              <w:t xml:space="preserve"> 2027/03</w:t>
             </w:r>
           </w:p>
         </w:tc>
@@ -9130,8 +9542,6 @@
               </w:rPr>
               <w:t>a3,a6</w:t>
             </w:r>
-            <w:proofErr w:type="gramStart"/>
-            <w:proofErr w:type="gramEnd"/>
           </w:p>
         </w:tc>
         <w:tc>
@@ -9148,7 +9558,6 @@
               <w:spacing w:before="80" w:line="360" w:lineRule="exact"/>
               <w:jc w:val="center"/>
             </w:pPr>
-            <w:r/>
           </w:p>
         </w:tc>
       </w:tr>
@@ -9186,7 +9595,14 @@
                 <w:sz w:val="20"/>
                 <w:szCs w:val="20"/>
               </w:rPr>
-              <w:t>4-5. 能重做反比例函數圖像與性質的辨識題</w:t>
+              <w:t xml:space="preserve">4-5. </w:t>
+            </w:r>
+            <w:r>
+              <w:rPr>
+                <w:sz w:val="20"/>
+                <w:szCs w:val="20"/>
+              </w:rPr>
+              <w:t>能重做反比例函數圖像與性質的辨識題</w:t>
             </w:r>
           </w:p>
         </w:tc>
@@ -9208,7 +9624,19 @@
               <w:rPr>
                 <w:rFonts w:hint="eastAsia"/>
               </w:rPr>
-              <w:t>2027/03 – 2027/03</w:t>
+              <w:t xml:space="preserve">2027/03 </w:t>
+            </w:r>
+            <w:r>
+              <w:rPr>
+                <w:rFonts w:hint="eastAsia"/>
+              </w:rPr>
+              <w:t>–</w:t>
+            </w:r>
+            <w:r>
+              <w:rPr>
+                <w:rFonts w:hint="eastAsia"/>
+              </w:rPr>
+              <w:t xml:space="preserve"> 2027/03</w:t>
             </w:r>
           </w:p>
         </w:tc>
@@ -9256,8 +9684,6 @@
               </w:rPr>
               <w:t>a3,a6</w:t>
             </w:r>
-            <w:proofErr w:type="gramStart"/>
-            <w:proofErr w:type="gramEnd"/>
           </w:p>
         </w:tc>
         <w:tc>
@@ -9274,7 +9700,6 @@
               <w:spacing w:before="80" w:line="360" w:lineRule="exact"/>
               <w:jc w:val="center"/>
             </w:pPr>
-            <w:r/>
           </w:p>
         </w:tc>
       </w:tr>
@@ -9312,7 +9737,14 @@
                 <w:sz w:val="20"/>
                 <w:szCs w:val="20"/>
               </w:rPr>
-              <w:t>5-1. 能重做比例線段的交叉相乘題</w:t>
+              <w:t xml:space="preserve">5-1. </w:t>
+            </w:r>
+            <w:r>
+              <w:rPr>
+                <w:sz w:val="20"/>
+                <w:szCs w:val="20"/>
+              </w:rPr>
+              <w:t>能重做比例線段的交叉相乘題</w:t>
             </w:r>
           </w:p>
         </w:tc>
@@ -9334,7 +9766,19 @@
               <w:rPr>
                 <w:rFonts w:hint="eastAsia"/>
               </w:rPr>
-              <w:t>2027/03 – 2027/03</w:t>
+              <w:t xml:space="preserve">2027/03 </w:t>
+            </w:r>
+            <w:r>
+              <w:rPr>
+                <w:rFonts w:hint="eastAsia"/>
+              </w:rPr>
+              <w:t>–</w:t>
+            </w:r>
+            <w:r>
+              <w:rPr>
+                <w:rFonts w:hint="eastAsia"/>
+              </w:rPr>
+              <w:t xml:space="preserve"> 2027/03</w:t>
             </w:r>
           </w:p>
         </w:tc>
@@ -9380,10 +9824,15 @@
                 <w:sz w:val="20"/>
                 <w:szCs w:val="20"/>
               </w:rPr>
-              <w:t>a11：公式卡</w:t>
-            </w:r>
-            <w:proofErr w:type="gramStart"/>
-            <w:proofErr w:type="gramEnd"/>
+              <w:t>a11</w:t>
+            </w:r>
+            <w:r>
+              <w:rPr>
+                <w:sz w:val="20"/>
+                <w:szCs w:val="20"/>
+              </w:rPr>
+              <w:t>：公式卡</w:t>
+            </w:r>
           </w:p>
         </w:tc>
         <w:tc>
@@ -9400,7 +9849,6 @@
               <w:spacing w:before="80" w:line="360" w:lineRule="exact"/>
               <w:jc w:val="center"/>
             </w:pPr>
-            <w:r/>
           </w:p>
         </w:tc>
       </w:tr>
@@ -9438,7 +9886,14 @@
                 <w:sz w:val="20"/>
                 <w:szCs w:val="20"/>
               </w:rPr>
-              <w:t>5-2. 能重做平行線分線段成比例的應用題，核對對應關係有沒有配錯</w:t>
+              <w:t xml:space="preserve">5-2. </w:t>
+            </w:r>
+            <w:r>
+              <w:rPr>
+                <w:sz w:val="20"/>
+                <w:szCs w:val="20"/>
+              </w:rPr>
+              <w:t>能重做平行線分線段成比例的應用題，核對對應關係有沒有配錯</w:t>
             </w:r>
           </w:p>
         </w:tc>
@@ -9460,7 +9915,19 @@
               <w:rPr>
                 <w:rFonts w:hint="eastAsia"/>
               </w:rPr>
-              <w:t>2027/04 – 2027/04</w:t>
+              <w:t xml:space="preserve">2027/04 </w:t>
+            </w:r>
+            <w:r>
+              <w:rPr>
+                <w:rFonts w:hint="eastAsia"/>
+              </w:rPr>
+              <w:t>–</w:t>
+            </w:r>
+            <w:r>
+              <w:rPr>
+                <w:rFonts w:hint="eastAsia"/>
+              </w:rPr>
+              <w:t xml:space="preserve"> 2027/04</w:t>
             </w:r>
           </w:p>
         </w:tc>
@@ -9508,8 +9975,6 @@
               </w:rPr>
               <w:t>a3</w:t>
             </w:r>
-            <w:proofErr w:type="gramStart"/>
-            <w:proofErr w:type="gramEnd"/>
           </w:p>
         </w:tc>
         <w:tc>
@@ -9526,7 +9991,6 @@
               <w:spacing w:before="80" w:line="360" w:lineRule="exact"/>
               <w:jc w:val="center"/>
             </w:pPr>
-            <w:r/>
           </w:p>
         </w:tc>
       </w:tr>
@@ -9564,7 +10028,14 @@
                 <w:sz w:val="20"/>
                 <w:szCs w:val="20"/>
               </w:rPr>
-              <w:t>5-3. 能重做相似三角形的判定題，先說出用哪一種判定法</w:t>
+              <w:t xml:space="preserve">5-3. </w:t>
+            </w:r>
+            <w:r>
+              <w:rPr>
+                <w:sz w:val="20"/>
+                <w:szCs w:val="20"/>
+              </w:rPr>
+              <w:t>能重做相似三角形的判定題，先說出用哪一種判定法</w:t>
             </w:r>
           </w:p>
         </w:tc>
@@ -9586,7 +10057,19 @@
               <w:rPr>
                 <w:rFonts w:hint="eastAsia"/>
               </w:rPr>
-              <w:t>2027/04 – 2027/04</w:t>
+              <w:t xml:space="preserve">2027/04 </w:t>
+            </w:r>
+            <w:r>
+              <w:rPr>
+                <w:rFonts w:hint="eastAsia"/>
+              </w:rPr>
+              <w:t>–</w:t>
+            </w:r>
+            <w:r>
+              <w:rPr>
+                <w:rFonts w:hint="eastAsia"/>
+              </w:rPr>
+              <w:t xml:space="preserve"> 2027/04</w:t>
             </w:r>
           </w:p>
         </w:tc>
@@ -9632,10 +10115,15 @@
                 <w:sz w:val="20"/>
                 <w:szCs w:val="20"/>
               </w:rPr>
-              <w:t>a11：判定卡</w:t>
-            </w:r>
-            <w:proofErr w:type="gramStart"/>
-            <w:proofErr w:type="gramEnd"/>
+              <w:t>a11</w:t>
+            </w:r>
+            <w:r>
+              <w:rPr>
+                <w:sz w:val="20"/>
+                <w:szCs w:val="20"/>
+              </w:rPr>
+              <w:t>：判定卡</w:t>
+            </w:r>
           </w:p>
         </w:tc>
         <w:tc>
@@ -9652,7 +10140,6 @@
               <w:spacing w:before="80" w:line="360" w:lineRule="exact"/>
               <w:jc w:val="center"/>
             </w:pPr>
-            <w:r/>
           </w:p>
         </w:tc>
       </w:tr>
@@ -9690,7 +10177,14 @@
                 <w:sz w:val="20"/>
                 <w:szCs w:val="20"/>
               </w:rPr>
-              <w:t>5-4. 能完成相似三角形與位似的綜合練習並訂正錯題</w:t>
+              <w:t xml:space="preserve">5-4. </w:t>
+            </w:r>
+            <w:r>
+              <w:rPr>
+                <w:sz w:val="20"/>
+                <w:szCs w:val="20"/>
+              </w:rPr>
+              <w:t>能完成相似三角形與位似的綜合練習並訂正錯題</w:t>
             </w:r>
           </w:p>
         </w:tc>
@@ -9712,7 +10206,19 @@
               <w:rPr>
                 <w:rFonts w:hint="eastAsia"/>
               </w:rPr>
-              <w:t>2027/04 – 2027/04</w:t>
+              <w:t xml:space="preserve">2027/04 </w:t>
+            </w:r>
+            <w:r>
+              <w:rPr>
+                <w:rFonts w:hint="eastAsia"/>
+              </w:rPr>
+              <w:t>–</w:t>
+            </w:r>
+            <w:r>
+              <w:rPr>
+                <w:rFonts w:hint="eastAsia"/>
+              </w:rPr>
+              <w:t xml:space="preserve"> 2027/04</w:t>
             </w:r>
           </w:p>
         </w:tc>
@@ -9760,8 +10266,6 @@
               </w:rPr>
               <w:t>a3,a6</w:t>
             </w:r>
-            <w:proofErr w:type="gramStart"/>
-            <w:proofErr w:type="gramEnd"/>
           </w:p>
         </w:tc>
         <w:tc>
@@ -9778,7 +10282,6 @@
               <w:spacing w:before="80" w:line="360" w:lineRule="exact"/>
               <w:jc w:val="center"/>
             </w:pPr>
-            <w:r/>
           </w:p>
         </w:tc>
       </w:tr>
@@ -9816,7 +10319,15 @@
                 <w:sz w:val="20"/>
                 <w:szCs w:val="20"/>
               </w:rPr>
-              <w:t>6-1. 能重做正弦、餘弦、正切三個比值的對照計算題</w:t>
+              <w:lastRenderedPageBreak/>
+              <w:t xml:space="preserve">6-1. </w:t>
+            </w:r>
+            <w:r>
+              <w:rPr>
+                <w:sz w:val="20"/>
+                <w:szCs w:val="20"/>
+              </w:rPr>
+              <w:t>能重做正弦、餘弦、正切三個比值的對照計算題</w:t>
             </w:r>
           </w:p>
         </w:tc>
@@ -9838,7 +10349,19 @@
               <w:rPr>
                 <w:rFonts w:hint="eastAsia"/>
               </w:rPr>
-              <w:t>2027/05 – 2027/05</w:t>
+              <w:t xml:space="preserve">2027/05 </w:t>
+            </w:r>
+            <w:r>
+              <w:rPr>
+                <w:rFonts w:hint="eastAsia"/>
+              </w:rPr>
+              <w:t>–</w:t>
+            </w:r>
+            <w:r>
+              <w:rPr>
+                <w:rFonts w:hint="eastAsia"/>
+              </w:rPr>
+              <w:t xml:space="preserve"> 2027/05</w:t>
             </w:r>
           </w:p>
         </w:tc>
@@ -9884,10 +10407,22 @@
                 <w:sz w:val="20"/>
                 <w:szCs w:val="20"/>
               </w:rPr>
-              <w:t>a11：公式卡,b5</w:t>
-            </w:r>
-            <w:proofErr w:type="gramStart"/>
-            <w:proofErr w:type="gramEnd"/>
+              <w:t>a11</w:t>
+            </w:r>
+            <w:r>
+              <w:rPr>
+                <w:sz w:val="20"/>
+                <w:szCs w:val="20"/>
+              </w:rPr>
+              <w:t>：公式卡</w:t>
+            </w:r>
+            <w:r>
+              <w:rPr>
+                <w:sz w:val="20"/>
+                <w:szCs w:val="20"/>
+              </w:rPr>
+              <w:t>,b5</w:t>
+            </w:r>
           </w:p>
         </w:tc>
         <w:tc>
@@ -9904,7 +10439,6 @@
               <w:spacing w:before="80" w:line="360" w:lineRule="exact"/>
               <w:jc w:val="center"/>
             </w:pPr>
-            <w:r/>
           </w:p>
         </w:tc>
       </w:tr>
@@ -9942,7 +10476,14 @@
                 <w:sz w:val="20"/>
                 <w:szCs w:val="20"/>
               </w:rPr>
-              <w:t>6-2. 能用計算機由三角函數值求角度，說出反函數的按鍵次序</w:t>
+              <w:t xml:space="preserve">6-2. </w:t>
+            </w:r>
+            <w:r>
+              <w:rPr>
+                <w:sz w:val="20"/>
+                <w:szCs w:val="20"/>
+              </w:rPr>
+              <w:t>能用計算機由三角函數值求角度，說出反函數的按鍵次序</w:t>
             </w:r>
           </w:p>
         </w:tc>
@@ -9964,7 +10505,19 @@
               <w:rPr>
                 <w:rFonts w:hint="eastAsia"/>
               </w:rPr>
-              <w:t>2027/05 – 2027/05</w:t>
+              <w:t xml:space="preserve">2027/05 </w:t>
+            </w:r>
+            <w:r>
+              <w:rPr>
+                <w:rFonts w:hint="eastAsia"/>
+              </w:rPr>
+              <w:t>–</w:t>
+            </w:r>
+            <w:r>
+              <w:rPr>
+                <w:rFonts w:hint="eastAsia"/>
+              </w:rPr>
+              <w:t xml:space="preserve"> 2027/05</w:t>
             </w:r>
           </w:p>
         </w:tc>
@@ -10012,8 +10565,6 @@
               </w:rPr>
               <w:t>b5</w:t>
             </w:r>
-            <w:proofErr w:type="gramStart"/>
-            <w:proofErr w:type="gramEnd"/>
           </w:p>
         </w:tc>
         <w:tc>
@@ -10030,7 +10581,6 @@
               <w:spacing w:before="80" w:line="360" w:lineRule="exact"/>
               <w:jc w:val="center"/>
             </w:pPr>
-            <w:r/>
           </w:p>
         </w:tc>
       </w:tr>
@@ -10068,7 +10618,14 @@
                 <w:sz w:val="20"/>
                 <w:szCs w:val="20"/>
               </w:rPr>
-              <w:t>6-3. 能覆述特殊角記憶表並完成錯題訂正</w:t>
+              <w:t xml:space="preserve">6-3. </w:t>
+            </w:r>
+            <w:r>
+              <w:rPr>
+                <w:sz w:val="20"/>
+                <w:szCs w:val="20"/>
+              </w:rPr>
+              <w:t>能覆述特殊角記憶表並完成錯題訂正</w:t>
             </w:r>
           </w:p>
         </w:tc>
@@ -10090,7 +10647,19 @@
               <w:rPr>
                 <w:rFonts w:hint="eastAsia"/>
               </w:rPr>
-              <w:t>2027/05 – 2027/05</w:t>
+              <w:t xml:space="preserve">2027/05 </w:t>
+            </w:r>
+            <w:r>
+              <w:rPr>
+                <w:rFonts w:hint="eastAsia"/>
+              </w:rPr>
+              <w:t>–</w:t>
+            </w:r>
+            <w:r>
+              <w:rPr>
+                <w:rFonts w:hint="eastAsia"/>
+              </w:rPr>
+              <w:t xml:space="preserve"> 2027/05</w:t>
             </w:r>
           </w:p>
         </w:tc>
@@ -10136,10 +10705,15 @@
                 <w:sz w:val="20"/>
                 <w:szCs w:val="20"/>
               </w:rPr>
-              <w:t>a11：公式卡</w:t>
-            </w:r>
-            <w:proofErr w:type="gramStart"/>
-            <w:proofErr w:type="gramEnd"/>
+              <w:t>a11</w:t>
+            </w:r>
+            <w:r>
+              <w:rPr>
+                <w:sz w:val="20"/>
+                <w:szCs w:val="20"/>
+              </w:rPr>
+              <w:t>：公式卡</w:t>
+            </w:r>
           </w:p>
         </w:tc>
         <w:tc>
@@ -10156,7 +10730,6 @@
               <w:spacing w:before="80" w:line="360" w:lineRule="exact"/>
               <w:jc w:val="center"/>
             </w:pPr>
-            <w:r/>
           </w:p>
         </w:tc>
       </w:tr>
@@ -10194,7 +10767,14 @@
                 <w:sz w:val="20"/>
                 <w:szCs w:val="20"/>
               </w:rPr>
-              <w:t>6-4. 能重做坡度應用題</w:t>
+              <w:t xml:space="preserve">6-4. </w:t>
+            </w:r>
+            <w:r>
+              <w:rPr>
+                <w:sz w:val="20"/>
+                <w:szCs w:val="20"/>
+              </w:rPr>
+              <w:t>能重做坡度應用題</w:t>
             </w:r>
           </w:p>
         </w:tc>
@@ -10216,7 +10796,19 @@
               <w:rPr>
                 <w:rFonts w:hint="eastAsia"/>
               </w:rPr>
-              <w:t>2027/06 – 2027/06</w:t>
+              <w:t xml:space="preserve">2027/06 </w:t>
+            </w:r>
+            <w:r>
+              <w:rPr>
+                <w:rFonts w:hint="eastAsia"/>
+              </w:rPr>
+              <w:t>–</w:t>
+            </w:r>
+            <w:r>
+              <w:rPr>
+                <w:rFonts w:hint="eastAsia"/>
+              </w:rPr>
+              <w:t xml:space="preserve"> 2027/06</w:t>
             </w:r>
           </w:p>
         </w:tc>
@@ -10262,10 +10854,22 @@
                 <w:sz w:val="20"/>
                 <w:szCs w:val="20"/>
               </w:rPr>
-              <w:t>a11：公式卡,b5</w:t>
-            </w:r>
-            <w:proofErr w:type="gramStart"/>
-            <w:proofErr w:type="gramEnd"/>
+              <w:t>a11</w:t>
+            </w:r>
+            <w:r>
+              <w:rPr>
+                <w:sz w:val="20"/>
+                <w:szCs w:val="20"/>
+              </w:rPr>
+              <w:t>：公式卡</w:t>
+            </w:r>
+            <w:r>
+              <w:rPr>
+                <w:sz w:val="20"/>
+                <w:szCs w:val="20"/>
+              </w:rPr>
+              <w:t>,b5</w:t>
+            </w:r>
           </w:p>
         </w:tc>
         <w:tc>
@@ -10282,7 +10886,6 @@
               <w:spacing w:before="80" w:line="360" w:lineRule="exact"/>
               <w:jc w:val="center"/>
             </w:pPr>
-            <w:r/>
           </w:p>
         </w:tc>
       </w:tr>
@@ -10320,7 +10923,14 @@
                 <w:sz w:val="20"/>
                 <w:szCs w:val="20"/>
               </w:rPr>
-              <w:t>6-5. 能辨識中心投影與平行投影兩種情況</w:t>
+              <w:t xml:space="preserve">6-5. </w:t>
+            </w:r>
+            <w:r>
+              <w:rPr>
+                <w:sz w:val="20"/>
+                <w:szCs w:val="20"/>
+              </w:rPr>
+              <w:t>能辨識中心投影與平行投影兩種情況</w:t>
             </w:r>
           </w:p>
         </w:tc>
@@ -10342,7 +10952,19 @@
               <w:rPr>
                 <w:rFonts w:hint="eastAsia"/>
               </w:rPr>
-              <w:t>2027/06 – 2027/06</w:t>
+              <w:t xml:space="preserve">2027/06 </w:t>
+            </w:r>
+            <w:r>
+              <w:rPr>
+                <w:rFonts w:hint="eastAsia"/>
+              </w:rPr>
+              <w:t>–</w:t>
+            </w:r>
+            <w:r>
+              <w:rPr>
+                <w:rFonts w:hint="eastAsia"/>
+              </w:rPr>
+              <w:t xml:space="preserve"> 2027/06</w:t>
             </w:r>
           </w:p>
         </w:tc>
@@ -10390,8 +11012,6 @@
               </w:rPr>
               <w:t>a3</w:t>
             </w:r>
-            <w:proofErr w:type="gramStart"/>
-            <w:proofErr w:type="gramEnd"/>
           </w:p>
         </w:tc>
         <w:tc>
@@ -10408,7 +11028,6 @@
               <w:spacing w:before="80" w:line="360" w:lineRule="exact"/>
               <w:jc w:val="center"/>
             </w:pPr>
-            <w:r/>
           </w:p>
         </w:tc>
       </w:tr>
@@ -10446,7 +11065,14 @@
                 <w:sz w:val="20"/>
                 <w:szCs w:val="20"/>
               </w:rPr>
-              <w:t>6-6. 能運用公式紙完成圓與幾何部分的總複習題</w:t>
+              <w:t xml:space="preserve">6-6. </w:t>
+            </w:r>
+            <w:r>
+              <w:rPr>
+                <w:sz w:val="20"/>
+                <w:szCs w:val="20"/>
+              </w:rPr>
+              <w:t>能運用公式紙完成圓與幾何部分的總複習題</w:t>
             </w:r>
           </w:p>
         </w:tc>
@@ -10468,7 +11094,19 @@
               <w:rPr>
                 <w:rFonts w:hint="eastAsia"/>
               </w:rPr>
-              <w:t>2027/06 – 2027/06</w:t>
+              <w:t xml:space="preserve">2027/06 </w:t>
+            </w:r>
+            <w:r>
+              <w:rPr>
+                <w:rFonts w:hint="eastAsia"/>
+              </w:rPr>
+              <w:t>–</w:t>
+            </w:r>
+            <w:r>
+              <w:rPr>
+                <w:rFonts w:hint="eastAsia"/>
+              </w:rPr>
+              <w:t xml:space="preserve"> 2027/06</w:t>
             </w:r>
           </w:p>
         </w:tc>
@@ -10514,10 +11152,15 @@
                 <w:sz w:val="20"/>
                 <w:szCs w:val="20"/>
               </w:rPr>
-              <w:t>a11：公式紙</w:t>
-            </w:r>
-            <w:proofErr w:type="gramStart"/>
-            <w:proofErr w:type="gramEnd"/>
+              <w:t>a11</w:t>
+            </w:r>
+            <w:r>
+              <w:rPr>
+                <w:sz w:val="20"/>
+                <w:szCs w:val="20"/>
+              </w:rPr>
+              <w:t>：公式紙</w:t>
+            </w:r>
           </w:p>
         </w:tc>
         <w:tc>
@@ -10534,7 +11177,6 @@
               <w:spacing w:before="80" w:line="360" w:lineRule="exact"/>
               <w:jc w:val="center"/>
             </w:pPr>
-            <w:r/>
           </w:p>
         </w:tc>
       </w:tr>
@@ -10594,7 +11236,19 @@
               <w:rPr>
                 <w:rFonts w:hint="eastAsia"/>
               </w:rPr>
-              <w:t>2026/09 – 2027/06</w:t>
+              <w:t xml:space="preserve">2026/09 </w:t>
+            </w:r>
+            <w:r>
+              <w:rPr>
+                <w:rFonts w:hint="eastAsia"/>
+              </w:rPr>
+              <w:t>–</w:t>
+            </w:r>
+            <w:r>
+              <w:rPr>
+                <w:rFonts w:hint="eastAsia"/>
+              </w:rPr>
+              <w:t xml:space="preserve"> 2027/06</w:t>
             </w:r>
           </w:p>
         </w:tc>
@@ -10635,14 +11289,6 @@
               <w:spacing w:before="80" w:line="360" w:lineRule="exact"/>
               <w:jc w:val="center"/>
             </w:pPr>
-            <w:r>
-              <w:rPr>
-                <w:sz w:val="20"/>
-                <w:szCs w:val="20"/>
-              </w:rPr>
-            </w:r>
-            <w:proofErr w:type="gramStart"/>
-            <w:proofErr w:type="gramEnd"/>
           </w:p>
         </w:tc>
         <w:tc>
@@ -10659,7 +11305,6 @@
               <w:spacing w:before="80" w:line="360" w:lineRule="exact"/>
               <w:jc w:val="center"/>
             </w:pPr>
-            <w:r/>
           </w:p>
         </w:tc>
       </w:tr>
@@ -10719,7 +11364,19 @@
               <w:rPr>
                 <w:rFonts w:hint="eastAsia"/>
               </w:rPr>
-              <w:t>2026/09 – 2027/06</w:t>
+              <w:t xml:space="preserve">2026/09 </w:t>
+            </w:r>
+            <w:r>
+              <w:rPr>
+                <w:rFonts w:hint="eastAsia"/>
+              </w:rPr>
+              <w:t>–</w:t>
+            </w:r>
+            <w:r>
+              <w:rPr>
+                <w:rFonts w:hint="eastAsia"/>
+              </w:rPr>
+              <w:t xml:space="preserve"> 2027/06</w:t>
             </w:r>
           </w:p>
         </w:tc>
@@ -10760,14 +11417,6 @@
               <w:spacing w:before="80" w:line="360" w:lineRule="exact"/>
               <w:jc w:val="center"/>
             </w:pPr>
-            <w:r>
-              <w:rPr>
-                <w:sz w:val="20"/>
-                <w:szCs w:val="20"/>
-              </w:rPr>
-            </w:r>
-            <w:proofErr w:type="gramStart"/>
-            <w:proofErr w:type="gramEnd"/>
           </w:p>
         </w:tc>
         <w:tc>
@@ -10784,7 +11433,6 @@
               <w:spacing w:before="80" w:line="360" w:lineRule="exact"/>
               <w:jc w:val="center"/>
             </w:pPr>
-            <w:r/>
           </w:p>
         </w:tc>
       </w:tr>
@@ -10844,7 +11492,19 @@
               <w:rPr>
                 <w:rFonts w:hint="eastAsia"/>
               </w:rPr>
-              <w:t>2026/09 – 2027/06</w:t>
+              <w:t xml:space="preserve">2026/09 </w:t>
+            </w:r>
+            <w:r>
+              <w:rPr>
+                <w:rFonts w:hint="eastAsia"/>
+              </w:rPr>
+              <w:t>–</w:t>
+            </w:r>
+            <w:r>
+              <w:rPr>
+                <w:rFonts w:hint="eastAsia"/>
+              </w:rPr>
+              <w:t xml:space="preserve"> 2027/06</w:t>
             </w:r>
           </w:p>
         </w:tc>
@@ -10890,10 +11550,15 @@
                 <w:sz w:val="20"/>
                 <w:szCs w:val="20"/>
               </w:rPr>
-              <w:t>a11：公式卡</w:t>
-            </w:r>
-            <w:proofErr w:type="gramStart"/>
-            <w:proofErr w:type="gramEnd"/>
+              <w:t>a11</w:t>
+            </w:r>
+            <w:r>
+              <w:rPr>
+                <w:sz w:val="20"/>
+                <w:szCs w:val="20"/>
+              </w:rPr>
+              <w:t>：公式卡</w:t>
+            </w:r>
           </w:p>
         </w:tc>
         <w:tc>
@@ -10910,7 +11575,6 @@
               <w:spacing w:before="80" w:line="360" w:lineRule="exact"/>
               <w:jc w:val="center"/>
             </w:pPr>
-            <w:r/>
           </w:p>
         </w:tc>
       </w:tr>
@@ -10950,8 +11614,8 @@
             <w:r>
               <w:rPr>
                 <w:rFonts w:hint="eastAsia"/>
-                <w:sz w:val="20"/>
-                <w:szCs w:val="20"/>
+                <w:sz w:val="22"/>
+                <w:szCs w:val="22"/>
               </w:rPr>
               <w:t>能在錯題本記錄錯誤成因，並在下一節前完成訂正。</w:t>
             </w:r>
@@ -10975,7 +11639,19 @@
               <w:rPr>
                 <w:rFonts w:hint="eastAsia"/>
               </w:rPr>
-              <w:t>2026/09 – 2027/06</w:t>
+              <w:t xml:space="preserve">2026/09 </w:t>
+            </w:r>
+            <w:r>
+              <w:rPr>
+                <w:rFonts w:hint="eastAsia"/>
+              </w:rPr>
+              <w:t>–</w:t>
+            </w:r>
+            <w:r>
+              <w:rPr>
+                <w:rFonts w:hint="eastAsia"/>
+              </w:rPr>
+              <w:t xml:space="preserve"> 2027/06</w:t>
             </w:r>
           </w:p>
         </w:tc>
@@ -11024,12 +11700,6 @@
                 <w:szCs w:val="20"/>
               </w:rPr>
             </w:pPr>
-            <w:r>
-              <w:rPr>
-                <w:sz w:val="20"/>
-                <w:szCs w:val="20"/>
-              </w:rPr>
-            </w:r>
           </w:p>
         </w:tc>
         <w:tc>
@@ -11046,7 +11716,6 @@
               <w:spacing w:before="80" w:line="360" w:lineRule="exact"/>
               <w:jc w:val="center"/>
             </w:pPr>
-            <w:r/>
           </w:p>
         </w:tc>
       </w:tr>
@@ -11161,19 +11830,11 @@
         </w:rPr>
         <w:t>a-</w:t>
       </w:r>
-      <w:proofErr w:type="gramStart"/>
       <w:r>
         <w:rPr>
           <w:szCs w:val="18"/>
         </w:rPr>
-        <w:t>測考調整</w:t>
-      </w:r>
-      <w:proofErr w:type="gramEnd"/>
-      <w:r>
-        <w:rPr>
-          <w:szCs w:val="18"/>
-        </w:rPr>
-        <w:t>：</w:t>
+        <w:t>測考調整：</w:t>
       </w:r>
       <w:r>
         <w:rPr>
@@ -11233,21 +11894,12 @@
         </w:rPr>
         <w:t xml:space="preserve">a4. </w:t>
       </w:r>
-      <w:proofErr w:type="gramStart"/>
       <w:r>
         <w:rPr>
           <w:rFonts w:hint="eastAsia"/>
           <w:szCs w:val="18"/>
         </w:rPr>
-        <w:t>列點簡</w:t>
-      </w:r>
-      <w:proofErr w:type="gramEnd"/>
-      <w:r>
-        <w:rPr>
-          <w:rFonts w:hint="eastAsia"/>
-          <w:szCs w:val="18"/>
-        </w:rPr>
-        <w:t>答；</w:t>
+        <w:t>列點簡答；</w:t>
       </w:r>
       <w:r>
         <w:rPr>
@@ -11275,21 +11927,12 @@
         </w:rPr>
         <w:t>增加題目行距或放大</w:t>
       </w:r>
-      <w:proofErr w:type="gramStart"/>
       <w:r>
         <w:rPr>
           <w:rFonts w:hint="eastAsia"/>
           <w:szCs w:val="18"/>
         </w:rPr>
-        <w:t>作答欄</w:t>
-      </w:r>
-      <w:proofErr w:type="gramEnd"/>
-      <w:r>
-        <w:rPr>
-          <w:rFonts w:hint="eastAsia"/>
-          <w:szCs w:val="18"/>
-        </w:rPr>
-        <w:t>；</w:t>
+        <w:t>作答欄；</w:t>
       </w:r>
       <w:r>
         <w:rPr>
@@ -11413,21 +12056,12 @@
         </w:rPr>
         <w:t xml:space="preserve">b3. </w:t>
       </w:r>
-      <w:proofErr w:type="gramStart"/>
       <w:r>
         <w:rPr>
           <w:rFonts w:hint="eastAsia"/>
           <w:szCs w:val="18"/>
         </w:rPr>
-        <w:t>點字機</w:t>
-      </w:r>
-      <w:proofErr w:type="gramEnd"/>
-      <w:r>
-        <w:rPr>
-          <w:rFonts w:hint="eastAsia"/>
-          <w:szCs w:val="18"/>
-        </w:rPr>
-        <w:t>；</w:t>
+        <w:t>點字機；</w:t>
       </w:r>
       <w:r>
         <w:rPr>
@@ -11501,21 +12135,12 @@
         </w:rPr>
         <w:t>c-</w:t>
       </w:r>
-      <w:proofErr w:type="gramStart"/>
       <w:r>
         <w:rPr>
           <w:rFonts w:hint="eastAsia"/>
           <w:szCs w:val="18"/>
         </w:rPr>
-        <w:t>測考時間</w:t>
-      </w:r>
-      <w:proofErr w:type="gramEnd"/>
-      <w:r>
-        <w:rPr>
-          <w:rFonts w:hint="eastAsia"/>
-          <w:szCs w:val="18"/>
-        </w:rPr>
-        <w:t>安排：</w:t>
+        <w:t>測考時間安排：</w:t>
       </w:r>
       <w:r>
         <w:rPr>
@@ -11523,21 +12148,12 @@
         </w:rPr>
         <w:t xml:space="preserve">c1. </w:t>
       </w:r>
-      <w:proofErr w:type="gramStart"/>
       <w:r>
         <w:rPr>
           <w:rFonts w:hint="eastAsia"/>
           <w:szCs w:val="18"/>
         </w:rPr>
-        <w:t>分日或</w:t>
-      </w:r>
-      <w:proofErr w:type="gramEnd"/>
-      <w:r>
-        <w:rPr>
-          <w:rFonts w:hint="eastAsia"/>
-          <w:szCs w:val="18"/>
-        </w:rPr>
-        <w:t>分段考核；</w:t>
+        <w:t>分日或分段考核；</w:t>
       </w:r>
       <w:r>
         <w:rPr>
@@ -12222,10 +12838,10 @@
                 <v:path o:extrusionok="f" gradientshapeok="t" o:connecttype="rect"/>
                 <o:lock v:ext="edit" aspectratio="t"/>
               </v:shapetype>
-              <v:shape id="_x0000_i1025" type="#_x0000_t75" style="width:46.2pt;height:56.4pt">
+              <v:shape id="_x0000_i1025" type="#_x0000_t75" style="width:46pt;height:56.65pt">
                 <v:imagedata r:id="rId1" o:title=""/>
               </v:shape>
-              <o:OLEObject Type="Embed" ProgID="PBrush" ShapeID="_x0000_i1025" DrawAspect="Content" ObjectID="_1845836817" r:id="rId2"/>
+              <o:OLEObject Type="Embed" ProgID="PBrush" ShapeID="_x0000_i1025" DrawAspect="Content" ObjectID="_1850496395" r:id="rId2"/>
             </w:object>
           </w:r>
         </w:p>
@@ -12386,10 +13002,10 @@
                 <v:path o:extrusionok="f" gradientshapeok="t" o:connecttype="rect"/>
                 <o:lock v:ext="edit" aspectratio="t"/>
               </v:shapetype>
-              <v:shape id="_x0000_i1026" type="#_x0000_t75" style="width:46.2pt;height:56.4pt">
+              <v:shape id="_x0000_i1026" type="#_x0000_t75" style="width:46pt;height:56.65pt">
                 <v:imagedata r:id="rId1" o:title=""/>
               </v:shape>
-              <o:OLEObject Type="Embed" ProgID="PBrush" ShapeID="_x0000_i1026" DrawAspect="Content" ObjectID="_1845836818" r:id="rId2"/>
+              <o:OLEObject Type="Embed" ProgID="PBrush" ShapeID="_x0000_i1026" DrawAspect="Content" ObjectID="_1850496396" r:id="rId2"/>
             </w:object>
           </w:r>
         </w:p>
@@ -14404,6 +15020,7 @@
   <w:style w:type="character" w:default="1" w:styleId="a1">
     <w:name w:val="Default Paragraph Font"/>
     <w:uiPriority w:val="1"/>
+    <w:semiHidden/>
     <w:unhideWhenUsed/>
   </w:style>
   <w:style w:type="table" w:default="1" w:styleId="a2">

</xml_diff>